<commit_message>
Flag critical citation-scope finding in ЭКО_2 protocol before full test
Two questions asked on 12.09 (2.1 at 15:06-15:07, 2.2 at 15:12) both
cite a document under a folder path "для теста ИИ (1)/..." instead of
the files we just uploaded to ЭКО_2. On 2.1, switching the search
scope between ЭКО_2 and ЭКО produced an identical answer and source,
which the scope selector should not allow if it actually restricts
retrieval to the chosen collection.

This means results from ЭКО_2 so far can't yet be trusted as evidence
about whether the corpus conversion fixed anything, since the
citations aren't coming from our uploaded corpus. Documents the
finding prominently and lists what to verify before continuing the
full 18-question run.

Co-Authored-By: Claude Sonnet 5 <noreply@anthropic.com>
Claude-Session: https://claude.ai/code/session_01DpSN8JwCJ3tg3JVUadr2zE
</commit_message>
<xml_diff>
--- a/docs/accounts/eco/pilot-test-03-eco2-protocol.docx
+++ b/docs/accounts/eco/pilot-test-03-eco2-protocol.docx
@@ -28,6 +28,44 @@
     <w:p>
       <w:r>
         <w:t>Статус документа: шаблон, готов к заполнению. Таблицы ниже пустые — заполнять по ходу теста, по одному скриншоту на вопрос на каждый проход.</w:t>
+      </w:r>
+    </w:p>
+    <w:p>
+      <w:pPr>
+        <w:pStyle w:val="Heading2"/>
+      </w:pPr>
+      <w:r>
+        <w:t>⚠ Критическая находка — до начала полного прогона 18 вопросов</w:t>
+      </w:r>
+    </w:p>
+    <w:p>
+      <w:r>
+        <w:t>12.09.2026, 15:06–15:07. Вопрос 2.1 («Какие поля заполняет оператор после фасовки продукции?») задан дважды подряд, теми же формулировками: сначала с областью поиска, суженной до коллекции «ЭКО_2», затем — до «ЭКО». Результат идентичен в обоих случаях: тот же текст ответа, та же карточка источника — «для теста ИИ (1)/И-15-06-08 Документальное оформление продукции ОСиС.docx» (86% → 88%).</w:t>
+      </w:r>
+    </w:p>
+    <w:p>
+      <w:r>
+        <w:t>12.09.2026, 15:12 — второе подтверждение. Вопрос 2.2 («Действия по корректировке Заказа на производство при выпуске продукции с меньшим весом.») — ответ верный и по существу (4 шага, включая «обратиться к ОБ», что соответствует И-12-10-03), но источник снова — «для теста ИИ (1)/И-12-10-03 Корректировка Заказу покупателя в 1С.docx» (70%), а не наш файл instrukciya-i-12-10-03-korrektirovka-zakaza-pokupatelya.docx, добавленный в ЭКО_2 только сегодня. Значимая деталь: И-12-10-03 в «для теста ИИ (1)» существовал ещё до того, как мы вообще получили этот документ от заказчика — это объясняет, почему И-12-10-03 уже цитировался в ре-тесте 12.09 (pilot-test-02-retest-protocol.md, §3) на коллекции eco, хотя в тот момент в нашем корпусе его не было вообще.</w:t>
+      </w:r>
+    </w:p>
+    <w:p>
+      <w:r>
+        <w:t>Проблема: оба пути/файла не совпадают с тем, что мы загрузили в ЭКО_2. Платформа дважды подряд, на двух разных вопросах, цитирует документы из одной и той же посторонней папки — не из свежезагруженного корпуса.</w:t>
+      </w:r>
+    </w:p>
+    <w:p>
+      <w:r>
+        <w:t>Почему это критично: если бы «Область поиска» реально ограничивала retrieval выбранной коллекцией, переключение ЭКО_2 → ЭКО (две разные коллекции с разным содержимым) обязано было изменить хотя бы путь источника. Этого не произошло. Два объяснения: (1) фильтр «Область поиска» по коллекции не применяется к retrieval на практике; (2) «для теста ИИ (1)» — общий источник (возможно, личная папка загрузок uploads_user_eco_user__misc, см. access-audit.md), не подчиняющийся ограничению по коллекции, и он выигрывает у только что загруженного корпуса.</w:t>
+      </w:r>
+    </w:p>
+    <w:p>
+      <w:r>
+        <w:t>Следствие: пока это не прояснено, результаты теста на ЭКО_2 не доказывают ничего о том, чинит ли переконвертация в .docx проблему парсинга — хорошие ответы (в т.ч. оба вопроса выше) могут объясняться тем, что «для теста ИИ (1)» содержал читаемые копии этих документов с самого начала, независимо от нашей работы с корпусом.</w:t>
+      </w:r>
+    </w:p>
+    <w:p>
+      <w:r>
+        <w:t>Перед продолжением прогона 18 вопросов сделать: (1) проверить статус индексации ЭКО_2 («готово» у всех 27 файлов); (2) задать вопрос с ответом, гарантированно уникальным для нового корпуса (деталь из И-12-12-06, у которого пока не подтверждено наличие копии в «для теста ИИ»); (3) уточнить у команды платформы, что такое «для теста ИИ (1)» и действительно ли «Область поиска» ограничивает retrieval.</w:t>
       </w:r>
     </w:p>
     <w:p>
@@ -2065,6 +2103,11 @@
       </w:r>
     </w:p>
     <w:p>
+      <w:r>
+        <w:t>Продолжение паттерна, найденное до начала полного теста (см. «Критическая находка» выше) — предварительная проверка 12.09 в 15:06–15:12 на двух вопросах (2.1 и 2.2) дважды подряд показала карточку «для теста ИИ (1)/...docx», не совпадающую с файлами из нашего корпуса ЭКО_2, причём на 2.1 — одинаково, независимо от того, была ли выбрана коллекция ЭКО_2 или ЭКО. Более тревожный вариант той же аномалии: здесь названия документов выглядят правдоподобно (совпадают с реальными номерами И-15-06-08 и И-12-10-03), из-за чего расхождение легко не заметить, если не сверять путь буквально.</w:t>
+      </w:r>
+    </w:p>
+    <w:p>
       <w:pPr>
         <w:pStyle w:val="Heading2"/>
       </w:pPr>

</xml_diff>

<commit_message>
Refine ЭКО_2 finding: source identified, removal plan recorded
The platform's document listing shows "для теста ИИ (1)" is a
subfolder inside the eco collection itself (domain "Эко"), uploaded
by user irina on 07.07.2026 — predating the 11.09 pilot. This rules
out the earlier guess about a separate uploads_user_eco_user__misc
source.

The core problem narrows: citing it while scoped to "ЭКО" is expected
(it lives in eco), but citing it while scoped to "ЭКО_2" (a different
collection) confirms the search-scope filter isn't actually
restricting retrieval. Records the user's decision to delete the
folder from eco before running the ЭКО_2 test, and what to check
afterward.

Co-Authored-By: Claude Sonnet 5 <noreply@anthropic.com>
Claude-Session: https://claude.ai/code/session_01DpSN8JwCJ3tg3JVUadr2zE
</commit_message>
<xml_diff>
--- a/docs/accounts/eco/pilot-test-03-eco2-protocol.docx
+++ b/docs/accounts/eco/pilot-test-03-eco2-protocol.docx
@@ -50,22 +50,22 @@
     </w:p>
     <w:p>
       <w:r>
-        <w:t>Проблема: оба пути/файла не совпадают с тем, что мы загрузили в ЭКО_2. Платформа дважды подряд, на двух разных вопросах, цитирует документы из одной и той же посторонней папки — не из свежезагруженного корпуса.</w:t>
+        <w:t>Уточнение источника (по скриншоту раздела «Источники → Документы»): «для теста ИИ (1)» — не скрытый сторонний источник, а подпапка внутри самой коллекции eco, домен «Эко», статус «Готово», загружена пользователем irina 07.07.2026 — за два месяца до пилота 11.09. Похоже, это оригинальный комплект, использовавшийся при первоначальной настройке ассистента, ещё до нашего участия. Это снимает гипотезу про отдельную «личную» коллекцию (uploads_user_eco_user__misc) — источник найден и объяснён.</w:t>
       </w:r>
     </w:p>
     <w:p>
       <w:r>
-        <w:t>Почему это критично: если бы «Область поиска» реально ограничивала retrieval выбранной коллекцией, переключение ЭКО_2 → ЭКО (две разные коллекции с разным содержимым) обязано было изменить хотя бы путь источника. Этого не произошло. Два объяснения: (1) фильтр «Область поиска» по коллекции не применяется к retrieval на практике; (2) «для теста ИИ (1)» — общий источник (возможно, личная папка загрузок uploads_user_eco_user__misc, см. access-audit.md), не подчиняющийся ограничению по коллекции, и он выигрывает у только что загруженного корпуса.</w:t>
+        <w:t>Проблема остаётся, но сужается: когда область поиска была сужена до «ЭКО» — цитирование «для теста ИИ (1)» полностью ожидаемо, это часть коллекции eco. Но когда область поиска была сужена до «ЭКО_2» (другая коллекция) и платформа всё равно вернула файл из eco — это подтверждает, что фильтр «Область поиска» не ограничивает retrieval выбранной коллекцией на практике (либо молча расширяет поиск на другие коллекции домена, когда в выбранной коллекции результат слабее/отсутствует).</w:t>
       </w:r>
     </w:p>
     <w:p>
       <w:r>
-        <w:t>Следствие: пока это не прояснено, результаты теста на ЭКО_2 не доказывают ничего о том, чинит ли переконвертация в .docx проблему парсинга — хорошие ответы (в т.ч. оба вопроса выше) могут объясняться тем, что «для теста ИИ (1)» содержал читаемые копии этих документов с самого начала, независимо от нашей работы с корпусом.</w:t>
+        <w:t>Следствие: пока это не устранено, результаты теста на ЭКО_2 не доказывают ничего о том, чинит ли переконвертация в .docx проблему парсинга — хорошие ответы (в т.ч. оба вопроса выше) могут быть заслугой «для теста ИИ (1)» из eco, а не загруженного нами корпуса.</w:t>
       </w:r>
     </w:p>
     <w:p>
       <w:r>
-        <w:t>Перед продолжением прогона 18 вопросов сделать: (1) проверить статус индексации ЭКО_2 («готово» у всех 27 файлов); (2) задать вопрос с ответом, гарантированно уникальным для нового корпуса (деталь из И-12-12-06, у которого пока не подтверждено наличие копии в «для теста ИИ»); (3) уточнить у команды платформы, что такое «для теста ИИ (1)» и действительно ли «Область поиска» ограничивает retrieval.</w:t>
+        <w:t>Принятое решение (12.09.2026): удалить «для теста ИИ (1)» из коллекции eco перед прогоном теста на ЭКО_2 — самый прямой способ убрать эту переменную. После удаления и повторного запуска теста проверить: (1) действительно ли ответы на 2.1/2.2 теперь опираются на файлы из ЭКО_2; (2) не появляется ли «не найдено» там, где раньше отвечал «для теста ИИ (1)» — это покажет реальную полноту нашего корпуса без маскировки чужими файлами. Дополнительно, если время позволит: уточнить у команды платформы, действительно ли «Область поиска» ограничивает retrieval — это системный вопрос, актуальный не только для «для теста ИИ (1)», но и для любого будущего использования сужения по коллекции.</w:t>
       </w:r>
     </w:p>
     <w:p>

</xml_diff>